<commit_message>
Generalise ongoing transaction descriptions in portfolio and CV
</commit_message>
<xml_diff>
--- a/Md_Asif_Iqbal_CV.docx
+++ b/Md_Asif_Iqbal_CV.docx
@@ -421,7 +421,7 @@
       </w:pPr>
       <w:r>
         <w:rPr/>
-        <w:t>2.  PwC Project Meridian</w:t>
+        <w:t>2.  Professional services acquisition</w:t>
       </w:r>
       <w:r>
         <w:rPr>
@@ -429,7 +429,7 @@
           <w:sz w:val="19"/>
         </w:rPr>
         <w:br/>
-        <w:t>Cross-border share acquisition • 2026</w:t>
+        <w:t>Cross-border acquisition • 2026–present</w:t>
       </w:r>
     </w:p>
     <w:p>
@@ -439,7 +439,7 @@
       </w:pPr>
       <w:r>
         <w:rPr/>
-        <w:t>Prepared Bangladesh due diligence on PricewaterhouseCoopers Bangladesh Private Limited for the proposed acquisition by PwC US Group LLP. Reviewed shareholding, title, charges and financing restrictions, and prepared warranty inputs and local transfer advice with Khaitan &amp; Co.</w:t>
+        <w:t>Prepared Bangladesh legal due diligence and transaction-document inputs for a proposed acquisition in the professional services sector, covering corporate ownership, security interests and financing restrictions.</w:t>
       </w:r>
     </w:p>
     <w:p>
@@ -449,7 +449,7 @@
       </w:pPr>
       <w:r>
         <w:rPr/>
-        <w:t>3.  Deloitte Bangladesh share transfer</w:t>
+        <w:t>3.  Professional services share transfer</w:t>
       </w:r>
       <w:r>
         <w:rPr>
@@ -457,7 +457,7 @@
           <w:sz w:val="19"/>
         </w:rPr>
         <w:br/>
-        <w:t>Proposed transfer of 100% shareholding • 2026</w:t>
+        <w:t>Transaction documentation • 2026–present</w:t>
       </w:r>
     </w:p>
     <w:p>
@@ -467,7 +467,7 @@
       </w:pPr>
       <w:r>
         <w:rPr/>
-        <w:t>Reviewed and revised the share-transfer agreement for transfers by Deloitte’s Indian entities to partners of affiliate firms. Addressed transfer mechanics, escrow, retransfer restrictions, enforceability, valuation and repatriation.</w:t>
+        <w:t>Reviewed and revised transaction documents for a proposed share transfer in the professional services sector, addressing transfer mechanics, contractual safeguards, enforceability and regulatory requirements.</w:t>
       </w:r>
     </w:p>
     <w:p>
@@ -561,7 +561,7 @@
       </w:pPr>
       <w:r>
         <w:rPr/>
-        <w:t>7.  Chaldal PLC strategic investment</w:t>
+        <w:t>7.  Online grocery investment</w:t>
       </w:r>
       <w:r>
         <w:rPr>
@@ -569,7 +569,7 @@
           <w:sz w:val="19"/>
         </w:rPr>
         <w:br/>
-        <w:t>Investment due diligence • 2026</w:t>
+        <w:t>Investment due diligence • 2026–present</w:t>
       </w:r>
     </w:p>
     <w:p>
@@ -579,7 +579,7 @@
       </w:pPr>
       <w:r>
         <w:rPr/>
-        <w:t>Prepared legal due diligence on financing, security interests, material contracts, intellectual property and regulatory compliance for a proposed investment.</w:t>
+        <w:t>Prepared legal due diligence for a proposed investment in an online grocery business, covering financing, security interests, material contracts, intellectual property and regulatory compliance.</w:t>
       </w:r>
     </w:p>
     <w:p>

</xml_diff>

<commit_message>
Strengthen anonymised experience descriptions with verified sector context
</commit_message>
<xml_diff>
--- a/Md_Asif_Iqbal_CV.docx
+++ b/Md_Asif_Iqbal_CV.docx
@@ -421,7 +421,7 @@
       </w:pPr>
       <w:r>
         <w:rPr/>
-        <w:t>2.  Professional services acquisition</w:t>
+        <w:t>2.  Acquisition involving a Big Four accounting network</w:t>
       </w:r>
       <w:r>
         <w:rPr>
@@ -439,7 +439,7 @@
       </w:pPr>
       <w:r>
         <w:rPr/>
-        <w:t>Prepared Bangladesh legal due diligence and transaction-document inputs for a proposed acquisition in the professional services sector, covering corporate ownership, security interests and financing restrictions.</w:t>
+        <w:t>Prepared Bangladesh legal due diligence for a proposed acquisition involving one of the world’s Big Four accounting networks. Reviewed corporate ownership, security interests and financing restrictions, and prepared inputs for transaction documents.</w:t>
       </w:r>
     </w:p>
     <w:p>
@@ -449,7 +449,7 @@
       </w:pPr>
       <w:r>
         <w:rPr/>
-        <w:t>3.  Professional services share transfer</w:t>
+        <w:t>3.  Share transfer involving a Big Four network</w:t>
       </w:r>
       <w:r>
         <w:rPr>
@@ -467,7 +467,7 @@
       </w:pPr>
       <w:r>
         <w:rPr/>
-        <w:t>Reviewed and revised transaction documents for a proposed share transfer in the professional services sector, addressing transfer mechanics, contractual safeguards, enforceability and regulatory requirements.</w:t>
+        <w:t>Reviewed and revised documents for a proposed share transfer involving a Big Four accounting and consulting network, addressing transfer mechanics, contractual safeguards, enforceability, valuation and repatriation.</w:t>
       </w:r>
     </w:p>
     <w:p>
@@ -477,7 +477,7 @@
       </w:pPr>
       <w:r>
         <w:rPr/>
-        <w:t>4.  Social enterprise restructuring</w:t>
+        <w:t>4.  Restructuring for one of the world’s largest NGOs</w:t>
       </w:r>
       <w:r>
         <w:rPr>
@@ -495,7 +495,7 @@
       </w:pPr>
       <w:r>
         <w:rPr/>
-        <w:t>Prepared due diligence and advice for a major NGO on a proposed court-sanctioned scheme of arrangement, asset and liability transfers and valuation. Worked on employee transfers, continuity of service, accrued rights, novation and statutory funds.</w:t>
+        <w:t>Prepared legal due diligence and advice for one of the world’s largest NGOs on restructuring three social enterprises through a proposed court-sanctioned scheme of arrangement. Covered asset and liability transfers, valuation, employee transfers, continuity of service, accrued rights, novation and statutory funds.</w:t>
       </w:r>
     </w:p>
     <w:p>
@@ -561,7 +561,7 @@
       </w:pPr>
       <w:r>
         <w:rPr/>
-        <w:t>7.  Online grocery investment</w:t>
+        <w:t>7.  Investment in Bangladesh’s largest online grocery platform</w:t>
       </w:r>
       <w:r>
         <w:rPr>
@@ -579,7 +579,7 @@
       </w:pPr>
       <w:r>
         <w:rPr/>
-        <w:t>Prepared legal due diligence for a proposed investment in an online grocery business, covering financing, security interests, material contracts, intellectual property and regulatory compliance.</w:t>
+        <w:t>Prepared legal due diligence for a proposed investment in Bangladesh’s largest online grocery platform, covering financing, security interests, material contracts, intellectual property and regulatory compliance.</w:t>
       </w:r>
     </w:p>
     <w:p>

</xml_diff>